<commit_message>
Require manual appearance review for all imports
</commit_message>
<xml_diff>
--- a/docs/manual/使用者手冊.docx
+++ b/docs/manual/使用者手冊.docx
@@ -20,7 +20,7 @@
         <w:rPr>
           <w:sz w:val="17"/>
         </w:rPr>
-        <w:t>適用對象 一般操作使用者    文件更新 2026 年 10 月 28 日</w:t>
+        <w:t>適用對象 一般操作使用者    文件更新 2026 年 10 月 29 日</w:t>
       </w:r>
     </w:p>
     <w:p>
@@ -48,7 +48,7 @@
         <w:spacing w:after="160"/>
       </w:pPr>
       <w:r>
-        <w:t>將 PDF 或圖片交由系統處理。多頁 PDF 會依頁碼分頁，逐頁完成外觀確認。</w:t>
+        <w:t>匯入 PDF 或圖片後，請人工逐頁檢查方向、角度與裁切，確認外觀後才會加入掃描清單。</w:t>
       </w:r>
     </w:p>
     <w:p>
@@ -87,7 +87,7 @@
         <w:ind w:left="288" w:hanging="288"/>
       </w:pPr>
       <w:r>
-        <w:t>2　選擇匯入流程。一般逐頁整理可使用「人工確認優先（快速）」；需要系統先分析方向與版面時，可選「完整自動（方向與版面分析）」。</w:t>
+        <w:t>2　將檔案拖曳至上傳區，或點選上傳區選取檔案。每次匯入一個檔案；檔案大小請依畫面提示辦理。</w:t>
       </w:r>
     </w:p>
     <w:p>
@@ -96,16 +96,7 @@
         <w:ind w:left="288" w:hanging="288"/>
       </w:pPr>
       <w:r>
-        <w:t>3　將檔案拖曳至上傳區，或點選上傳區選取檔案。每次匯入一個檔案；檔案大小請依畫面提示辦理。</w:t>
-      </w:r>
-    </w:p>
-    <w:p>
-      <w:pPr>
-        <w:spacing w:after="100"/>
-        <w:ind w:left="288" w:hanging="288"/>
-      </w:pPr>
-      <w:r>
-        <w:t>4　等候系統分析總頁數並準備頁面預覽。當畫面提示可進行外觀確認時，按「繼續外觀確認」。</w:t>
+        <w:t>3　等候系統分析總頁數並準備頁面預覽。當畫面提示可進行外觀確認時，按「繼續外觀確認」。</w:t>
       </w:r>
     </w:p>
     <w:p>

</xml_diff>